<commit_message>
Fixed spelling mistake in study Notes
Co-Authored-By: Daniel Briffa <185497753+dBrif24@users.noreply.github.com>
Co-Authored-By: Samuel <samuel.bugeja.24@um.edu.mt>
</commit_message>
<xml_diff>
--- a/study_notes.docx
+++ b/study_notes.docx
@@ -409,12 +409,12 @@
           <wp:inline distB="114300" distT="114300" distL="114300" distR="114300">
             <wp:extent cx="981075" cy="675285"/>
             <wp:effectExtent b="0" l="0" r="0" t="0"/>
-            <wp:docPr id="6" name="image1.png"/>
+            <wp:docPr id="6" name="image7.png"/>
             <a:graphic>
               <a:graphicData uri="http://schemas.openxmlformats.org/drawingml/2006/picture">
                 <pic:pic>
                   <pic:nvPicPr>
-                    <pic:cNvPr id="0" name="image1.png"/>
+                    <pic:cNvPr id="0" name="image7.png"/>
                     <pic:cNvPicPr preferRelativeResize="0"/>
                   </pic:nvPicPr>
                   <pic:blipFill>
@@ -473,12 +473,12 @@
           <wp:inline distB="114300" distT="114300" distL="114300" distR="114300">
             <wp:extent cx="1105872" cy="737248"/>
             <wp:effectExtent b="0" l="0" r="0" t="0"/>
-            <wp:docPr id="10" name="image11.png"/>
+            <wp:docPr id="10" name="image1.png"/>
             <a:graphic>
               <a:graphicData uri="http://schemas.openxmlformats.org/drawingml/2006/picture">
                 <pic:pic>
                   <pic:nvPicPr>
-                    <pic:cNvPr id="0" name="image11.png"/>
+                    <pic:cNvPr id="0" name="image1.png"/>
                     <pic:cNvPicPr preferRelativeResize="0"/>
                   </pic:nvPicPr>
                   <pic:blipFill>
@@ -883,12 +883,12 @@
           <wp:inline distB="114300" distT="114300" distL="114300" distR="114300">
             <wp:extent cx="942814" cy="599973"/>
             <wp:effectExtent b="0" l="0" r="0" t="0"/>
-            <wp:docPr id="11" name="image4.png"/>
+            <wp:docPr id="11" name="image3.png"/>
             <a:graphic>
               <a:graphicData uri="http://schemas.openxmlformats.org/drawingml/2006/picture">
                 <pic:pic>
                   <pic:nvPicPr>
-                    <pic:cNvPr id="0" name="image4.png"/>
+                    <pic:cNvPr id="0" name="image3.png"/>
                     <pic:cNvPicPr preferRelativeResize="0"/>
                   </pic:nvPicPr>
                   <pic:blipFill>
@@ -969,12 +969,12 @@
           <wp:inline distB="114300" distT="114300" distL="114300" distR="114300">
             <wp:extent cx="890588" cy="499979"/>
             <wp:effectExtent b="0" l="0" r="0" t="0"/>
-            <wp:docPr id="5" name="image14.png"/>
+            <wp:docPr id="5" name="image8.png"/>
             <a:graphic>
               <a:graphicData uri="http://schemas.openxmlformats.org/drawingml/2006/picture">
                 <pic:pic>
                   <pic:nvPicPr>
-                    <pic:cNvPr id="0" name="image14.png"/>
+                    <pic:cNvPr id="0" name="image8.png"/>
                     <pic:cNvPicPr preferRelativeResize="0"/>
                   </pic:nvPicPr>
                   <pic:blipFill>
@@ -1099,12 +1099,12 @@
             <wp:extent cx="1747838" cy="424933"/>
             <wp:effectExtent b="0" l="0" r="0" t="0"/>
             <wp:wrapNone/>
-            <wp:docPr id="1" name="image13.png"/>
+            <wp:docPr id="1" name="image5.png"/>
             <a:graphic>
               <a:graphicData uri="http://schemas.openxmlformats.org/drawingml/2006/picture">
                 <pic:pic>
                   <pic:nvPicPr>
-                    <pic:cNvPr id="0" name="image13.png"/>
+                    <pic:cNvPr id="0" name="image5.png"/>
                     <pic:cNvPicPr preferRelativeResize="0"/>
                   </pic:nvPicPr>
                   <pic:blipFill>
@@ -1452,12 +1452,12 @@
           <wp:inline distB="114300" distT="114300" distL="114300" distR="114300">
             <wp:extent cx="1045499" cy="765454"/>
             <wp:effectExtent b="0" l="0" r="0" t="0"/>
-            <wp:docPr id="3" name="image8.png"/>
+            <wp:docPr id="3" name="image10.png"/>
             <a:graphic>
               <a:graphicData uri="http://schemas.openxmlformats.org/drawingml/2006/picture">
                 <pic:pic>
                   <pic:nvPicPr>
-                    <pic:cNvPr id="0" name="image8.png"/>
+                    <pic:cNvPr id="0" name="image10.png"/>
                     <pic:cNvPicPr preferRelativeResize="0"/>
                   </pic:nvPicPr>
                   <pic:blipFill>
@@ -1513,12 +1513,12 @@
           <wp:inline distB="114300" distT="114300" distL="114300" distR="114300">
             <wp:extent cx="1081627" cy="709379"/>
             <wp:effectExtent b="0" l="0" r="0" t="0"/>
-            <wp:docPr id="8" name="image5.png"/>
+            <wp:docPr id="8" name="image12.png"/>
             <a:graphic>
               <a:graphicData uri="http://schemas.openxmlformats.org/drawingml/2006/picture">
                 <pic:pic>
                   <pic:nvPicPr>
-                    <pic:cNvPr id="0" name="image5.png"/>
+                    <pic:cNvPr id="0" name="image12.png"/>
                     <pic:cNvPicPr preferRelativeResize="0"/>
                   </pic:nvPicPr>
                   <pic:blipFill>
@@ -2145,12 +2145,12 @@
           <wp:inline distB="114300" distT="114300" distL="114300" distR="114300">
             <wp:extent cx="1057914" cy="666348"/>
             <wp:effectExtent b="0" l="0" r="0" t="0"/>
-            <wp:docPr id="2" name="image3.png"/>
+            <wp:docPr id="2" name="image11.png"/>
             <a:graphic>
               <a:graphicData uri="http://schemas.openxmlformats.org/drawingml/2006/picture">
                 <pic:pic>
                   <pic:nvPicPr>
-                    <pic:cNvPr id="0" name="image3.png"/>
+                    <pic:cNvPr id="0" name="image11.png"/>
                     <pic:cNvPicPr preferRelativeResize="0"/>
                   </pic:nvPicPr>
                   <pic:blipFill>
@@ -2205,12 +2205,12 @@
           <wp:inline distB="114300" distT="114300" distL="114300" distR="114300">
             <wp:extent cx="1109663" cy="727279"/>
             <wp:effectExtent b="0" l="0" r="0" t="0"/>
-            <wp:docPr id="9" name="image7.png"/>
+            <wp:docPr id="9" name="image14.png"/>
             <a:graphic>
               <a:graphicData uri="http://schemas.openxmlformats.org/drawingml/2006/picture">
                 <pic:pic>
                   <pic:nvPicPr>
-                    <pic:cNvPr id="0" name="image7.png"/>
+                    <pic:cNvPr id="0" name="image14.png"/>
                     <pic:cNvPicPr preferRelativeResize="0"/>
                   </pic:nvPicPr>
                   <pic:blipFill>
@@ -2265,12 +2265,12 @@
           <wp:inline distB="114300" distT="114300" distL="114300" distR="114300">
             <wp:extent cx="1909763" cy="785323"/>
             <wp:effectExtent b="0" l="0" r="0" t="0"/>
-            <wp:docPr id="7" name="image12.png"/>
+            <wp:docPr id="7" name="image6.png"/>
             <a:graphic>
               <a:graphicData uri="http://schemas.openxmlformats.org/drawingml/2006/picture">
                 <pic:pic>
                   <pic:nvPicPr>
-                    <pic:cNvPr id="0" name="image12.png"/>
+                    <pic:cNvPr id="0" name="image6.png"/>
                     <pic:cNvPicPr preferRelativeResize="0"/>
                   </pic:nvPicPr>
                   <pic:blipFill>
@@ -2325,12 +2325,12 @@
           <wp:inline distB="114300" distT="114300" distL="114300" distR="114300">
             <wp:extent cx="3243263" cy="560795"/>
             <wp:effectExtent b="0" l="0" r="0" t="0"/>
-            <wp:docPr id="13" name="image9.png"/>
+            <wp:docPr id="13" name="image2.png"/>
             <a:graphic>
               <a:graphicData uri="http://schemas.openxmlformats.org/drawingml/2006/picture">
                 <pic:pic>
                   <pic:nvPicPr>
-                    <pic:cNvPr id="0" name="image9.png"/>
+                    <pic:cNvPr id="0" name="image2.png"/>
                     <pic:cNvPicPr preferRelativeResize="0"/>
                   </pic:nvPicPr>
                   <pic:blipFill>
@@ -2387,12 +2387,12 @@
           <wp:inline distB="114300" distT="114300" distL="114300" distR="114300">
             <wp:extent cx="656028" cy="413711"/>
             <wp:effectExtent b="0" l="0" r="0" t="0"/>
-            <wp:docPr id="12" name="image10.png"/>
+            <wp:docPr id="12" name="image9.png"/>
             <a:graphic>
               <a:graphicData uri="http://schemas.openxmlformats.org/drawingml/2006/picture">
                 <pic:pic>
                   <pic:nvPicPr>
-                    <pic:cNvPr id="0" name="image10.png"/>
+                    <pic:cNvPr id="0" name="image9.png"/>
                     <pic:cNvPicPr preferRelativeResize="0"/>
                   </pic:nvPicPr>
                   <pic:blipFill>
@@ -2462,12 +2462,12 @@
           <wp:inline distB="114300" distT="114300" distL="114300" distR="114300">
             <wp:extent cx="259080" cy="190500"/>
             <wp:effectExtent b="0" l="0" r="0" t="0"/>
-            <wp:docPr id="14" name="image6.png"/>
+            <wp:docPr id="14" name="image4.png"/>
             <a:graphic>
               <a:graphicData uri="http://schemas.openxmlformats.org/drawingml/2006/picture">
                 <pic:pic>
                   <pic:nvPicPr>
-                    <pic:cNvPr id="0" name="image6.png"/>
+                    <pic:cNvPr id="0" name="image4.png"/>
                     <pic:cNvPicPr preferRelativeResize="0"/>
                   </pic:nvPicPr>
                   <pic:blipFill>
@@ -2831,7 +2831,7 @@
           <w:szCs w:val="34"/>
           <w:rtl w:val="0"/>
         </w:rPr>
-        <w:t xml:space="preserve">Pipiline</w:t>
+        <w:t xml:space="preserve">Pipeline</w:t>
       </w:r>
     </w:p>
     <w:p>
@@ -4513,12 +4513,12 @@
           <wp:inline distB="114300" distT="114300" distL="114300" distR="114300">
             <wp:extent cx="3614738" cy="2509965"/>
             <wp:effectExtent b="0" l="0" r="0" t="0"/>
-            <wp:docPr id="4" name="image2.png"/>
+            <wp:docPr id="4" name="image13.png"/>
             <a:graphic>
               <a:graphicData uri="http://schemas.openxmlformats.org/drawingml/2006/picture">
                 <pic:pic>
                   <pic:nvPicPr>
-                    <pic:cNvPr id="0" name="image2.png"/>
+                    <pic:cNvPr id="0" name="image13.png"/>
                     <pic:cNvPicPr preferRelativeResize="0"/>
                   </pic:nvPicPr>
                   <pic:blipFill>

</xml_diff>